<commit_message>
feat: support multiple soldiers in training reports
</commit_message>
<xml_diff>
--- a/templates/training-with-weapon-report-template.docx
+++ b/templates/training-with-weapon-report-template.docx
@@ -15,9 +15,9 @@
           <w:szCs w:val="28"/>
         </w:rPr>
       </w:pPr>
-      <w:bookmarkStart w:id="0" w:name="_Hlk154479912"/>
+      <w:bookmarkStart w:id="0" w:name="_Hlk181012029"/>
       <w:bookmarkEnd w:id="0"/>
-      <w:bookmarkStart w:id="1" w:name="_Hlk181012029"/>
+      <w:bookmarkStart w:id="1" w:name="_Hlk154479912"/>
       <w:bookmarkEnd w:id="1"/>
       <w:r>
         <w:rPr>
@@ -126,7 +126,7 @@
           <w:szCs w:val="28"/>
           <w:lang w:val="uk-UA"/>
         </w:rPr>
-        <w:t>Прошу Вас відрядити з {{startDate}} по {{endDate}} ({{days}} днів) до {{destination}} {{rankGenitive}} {{soldierFullNameGenitive}}, {{position}} з закріпленою за ним зброєю, {{weapon}}, з метою {{trainingPurpose}}.</w:t>
+        <w:t>Прошу Вас відрядити з {{startDate}} по {{endDate}} ({{days}} днів) до {{destination}}:</w:t>
       </w:r>
     </w:p>
     <w:p>
@@ -135,110 +135,163 @@
         <w:ind w:firstLine="709"/>
         <w:jc w:val="both"/>
         <w:rPr>
-          <w:rFonts w:ascii="Times New Roman" w:hAnsi="Times New Roman" w:cs="Times New Roman"/>
-          <w:sz w:val="28"/>
-          <w:szCs w:val="28"/>
-          <w:lang w:val="uk-UA"/>
-        </w:rPr>
-      </w:pPr>
-      <w:r>
-        <w:rPr>
-          <w:rFonts w:ascii="Times New Roman" w:hAnsi="Times New Roman" w:cs="Times New Roman"/>
-          <w:sz w:val="28"/>
-          <w:szCs w:val="28"/>
-          <w:lang w:val="uk-UA"/>
-        </w:rPr>
-        <w:t>Підстава: {{basis}}.</w:t>
-      </w:r>
-    </w:p>
-    <w:p>
-      <w:pPr>
-        <w:spacing w:before="0" w:after="0" w:line="240" w:lineRule="auto"/>
-        <w:ind w:firstLine="709"/>
-        <w:jc w:val="both"/>
-        <w:rPr>
-          <w:rFonts w:ascii="Times New Roman" w:hAnsi="Times New Roman" w:cs="Times New Roman"/>
-          <w:sz w:val="28"/>
-          <w:szCs w:val="28"/>
-          <w:lang w:val="uk-UA"/>
-        </w:rPr>
-      </w:pPr>
-      <w:r>
-        <w:rPr>
-          <w:rFonts w:ascii="Times New Roman" w:hAnsi="Times New Roman" w:cs="Times New Roman"/>
-          <w:sz w:val="28"/>
-          <w:szCs w:val="28"/>
-          <w:lang w:val="uk-UA"/>
-        </w:rPr>
-        <w:t>Прошу видати продовольчий атестат.</w:t>
-      </w:r>
-    </w:p>
-    <w:p>
-      <w:pPr>
-        <w:spacing w:before="0" w:after="0" w:line="240" w:lineRule="auto"/>
-        <w:ind w:firstLine="709"/>
-        <w:jc w:val="both"/>
-        <w:rPr>
-          <w:rFonts w:ascii="Times New Roman" w:hAnsi="Times New Roman" w:cs="Times New Roman"/>
-          <w:sz w:val="28"/>
-          <w:szCs w:val="28"/>
-          <w:lang w:val="uk-UA"/>
-        </w:rPr>
-      </w:pPr>
-      <w:r>
-        <w:rPr>
-          <w:rFonts w:hint="default" w:ascii="Times New Roman" w:hAnsi="Times New Roman"/>
-          <w:sz w:val="28"/>
-          <w:szCs w:val="28"/>
-          <w:lang w:val="uk-UA"/>
-        </w:rPr>
-        <w:t>{{dryRationText}}</w:t>
-      </w:r>
-    </w:p>
-    <w:p>
-      <w:pPr>
-        <w:spacing w:before="0" w:after="0" w:line="240" w:lineRule="auto"/>
-        <w:ind w:firstLine="709"/>
-        <w:jc w:val="both"/>
-        <w:rPr>
-          <w:rFonts w:ascii="Times New Roman" w:hAnsi="Times New Roman" w:cs="Times New Roman"/>
-          <w:sz w:val="28"/>
-          <w:szCs w:val="28"/>
-          <w:lang w:val="uk-UA"/>
-        </w:rPr>
-      </w:pPr>
-    </w:p>
-    <w:p>
-      <w:pPr>
-        <w:spacing w:before="0" w:after="0" w:line="240" w:lineRule="auto"/>
-        <w:jc w:val="both"/>
-        <w:rPr>
           <w:rFonts w:hint="default" w:ascii="Times New Roman" w:hAnsi="Times New Roman" w:cs="Times New Roman"/>
           <w:sz w:val="28"/>
           <w:szCs w:val="28"/>
-          <w:lang w:val="uk-UA"/>
-        </w:rPr>
-      </w:pPr>
-      <w:r>
-        <w:rPr>
-          <w:rFonts w:ascii="Times New Roman" w:hAnsi="Times New Roman" w:cs="Times New Roman"/>
-          <w:sz w:val="28"/>
-          <w:szCs w:val="28"/>
-          <w:lang w:val="uk-UA"/>
-        </w:rPr>
-        <w:t>{{companyCommanderPosition}}</w:t>
+          <w:lang w:val="en-US"/>
+        </w:rPr>
+      </w:pPr>
+      <w:r>
+        <w:rPr>
+          <w:rFonts w:ascii="Times New Roman" w:hAnsi="Times New Roman" w:cs="Times New Roman"/>
+          <w:sz w:val="28"/>
+          <w:szCs w:val="28"/>
+          <w:lang w:val="uk-UA"/>
+        </w:rPr>
+        <w:t>{{soldiersList}}</w:t>
       </w:r>
       <w:r>
         <w:rPr>
           <w:rFonts w:hint="default" w:ascii="Times New Roman" w:hAnsi="Times New Roman" w:cs="Times New Roman"/>
           <w:sz w:val="28"/>
           <w:szCs w:val="28"/>
-          <w:lang w:val="uk-UA"/>
-        </w:rPr>
-        <w:t>.</w:t>
+          <w:lang w:val="en-US"/>
+        </w:rPr>
+        <w:t>,</w:t>
       </w:r>
       <w:bookmarkStart w:id="2" w:name="_GoBack"/>
       <w:bookmarkEnd w:id="2"/>
+    </w:p>
+    <w:p>
+      <w:pPr>
+        <w:spacing w:before="0" w:after="0" w:line="240" w:lineRule="auto"/>
+        <w:ind w:firstLine="709"/>
+        <w:jc w:val="both"/>
+        <w:rPr>
+          <w:rFonts w:ascii="Times New Roman" w:hAnsi="Times New Roman" w:cs="Times New Roman"/>
+          <w:sz w:val="28"/>
+          <w:szCs w:val="28"/>
+          <w:lang w:val="uk-UA"/>
+        </w:rPr>
+      </w:pPr>
+      <w:r>
+        <w:rPr>
+          <w:rFonts w:ascii="Times New Roman" w:hAnsi="Times New Roman" w:cs="Times New Roman"/>
+          <w:sz w:val="28"/>
+          <w:szCs w:val="28"/>
+          <w:lang w:val="uk-UA"/>
+        </w:rPr>
+        <w:t>з метою {{trainingPurpose}}.</w:t>
+      </w:r>
+    </w:p>
+    <w:p>
+      <w:pPr>
+        <w:spacing w:before="0" w:after="0" w:line="240" w:lineRule="auto"/>
+        <w:ind w:firstLine="709"/>
+        <w:jc w:val="both"/>
+        <w:rPr>
+          <w:rFonts w:ascii="Times New Roman" w:hAnsi="Times New Roman" w:cs="Times New Roman"/>
+          <w:sz w:val="28"/>
+          <w:szCs w:val="28"/>
+          <w:lang w:val="uk-UA"/>
+        </w:rPr>
+      </w:pPr>
+      <w:r>
+        <w:rPr>
+          <w:rFonts w:ascii="Times New Roman" w:hAnsi="Times New Roman" w:cs="Times New Roman"/>
+          <w:sz w:val="28"/>
+          <w:szCs w:val="28"/>
+          <w:lang w:val="uk-UA"/>
+        </w:rPr>
+        <w:t>Підстава: {{basis}}.</w:t>
+      </w:r>
+    </w:p>
+    <w:p>
+      <w:pPr>
+        <w:spacing w:before="0" w:after="0" w:line="240" w:lineRule="auto"/>
+        <w:ind w:firstLine="709"/>
+        <w:jc w:val="both"/>
+        <w:rPr>
+          <w:rFonts w:ascii="Times New Roman" w:hAnsi="Times New Roman" w:cs="Times New Roman"/>
+          <w:sz w:val="28"/>
+          <w:szCs w:val="28"/>
+          <w:lang w:val="uk-UA"/>
+        </w:rPr>
+      </w:pPr>
+      <w:r>
+        <w:rPr>
+          <w:rFonts w:ascii="Times New Roman" w:hAnsi="Times New Roman" w:cs="Times New Roman"/>
+          <w:sz w:val="28"/>
+          <w:szCs w:val="28"/>
+          <w:lang w:val="uk-UA"/>
+        </w:rPr>
+        <w:t>Прошу видати продовольчий атестат.</w:t>
+      </w:r>
+    </w:p>
+    <w:p>
+      <w:pPr>
+        <w:spacing w:before="0" w:after="0" w:line="240" w:lineRule="auto"/>
+        <w:ind w:firstLine="709"/>
+        <w:jc w:val="both"/>
+        <w:rPr>
+          <w:rFonts w:ascii="Times New Roman" w:hAnsi="Times New Roman" w:cs="Times New Roman"/>
+          <w:sz w:val="28"/>
+          <w:szCs w:val="28"/>
+          <w:lang w:val="uk-UA"/>
+        </w:rPr>
+      </w:pPr>
+      <w:r>
+        <w:rPr>
+          <w:rFonts w:hint="default" w:ascii="Times New Roman" w:hAnsi="Times New Roman"/>
+          <w:sz w:val="28"/>
+          <w:szCs w:val="28"/>
+          <w:lang w:val="uk-UA"/>
+        </w:rPr>
+        <w:t>{{dryRationText}}</w:t>
+      </w:r>
+    </w:p>
+    <w:p>
+      <w:pPr>
+        <w:spacing w:before="0" w:after="0" w:line="240" w:lineRule="auto"/>
+        <w:ind w:firstLine="709"/>
+        <w:jc w:val="both"/>
+        <w:rPr>
+          <w:rFonts w:ascii="Times New Roman" w:hAnsi="Times New Roman" w:cs="Times New Roman"/>
+          <w:sz w:val="28"/>
+          <w:szCs w:val="28"/>
+          <w:lang w:val="uk-UA"/>
+        </w:rPr>
+      </w:pPr>
+    </w:p>
+    <w:p>
+      <w:pPr>
+        <w:spacing w:before="0" w:after="0" w:line="240" w:lineRule="auto"/>
+        <w:jc w:val="both"/>
+        <w:rPr>
+          <w:rFonts w:hint="default" w:ascii="Times New Roman" w:hAnsi="Times New Roman" w:cs="Times New Roman"/>
+          <w:sz w:val="28"/>
+          <w:szCs w:val="28"/>
+          <w:lang w:val="uk-UA"/>
+        </w:rPr>
+      </w:pPr>
+      <w:r>
+        <w:rPr>
+          <w:rFonts w:ascii="Times New Roman" w:hAnsi="Times New Roman" w:cs="Times New Roman"/>
+          <w:sz w:val="28"/>
+          <w:szCs w:val="28"/>
+          <w:lang w:val="uk-UA"/>
+        </w:rPr>
+        <w:t>{{companyCommanderPosition}}</w:t>
+      </w:r>
+      <w:r>
+        <w:rPr>
+          <w:rFonts w:hint="default" w:ascii="Times New Roman" w:hAnsi="Times New Roman" w:cs="Times New Roman"/>
+          <w:sz w:val="28"/>
+          <w:szCs w:val="28"/>
+          <w:lang w:val="uk-UA"/>
+        </w:rPr>
+        <w:t>.</w:t>
+      </w:r>
     </w:p>
     <w:tbl>
       <w:tblPr>
@@ -1040,7 +1093,7 @@
     <w:lsdException w:uiPriority="99" w:name="Table Web 2"/>
     <w:lsdException w:uiPriority="99" w:name="Table Web 3"/>
     <w:lsdException w:uiPriority="99" w:name="Balloon Text"/>
-    <w:lsdException w:unhideWhenUsed="0" w:uiPriority="39" w:semiHidden="0" w:name="Table Grid"/>
+    <w:lsdException w:qFormat="1" w:unhideWhenUsed="0" w:uiPriority="39" w:semiHidden="0" w:name="Table Grid"/>
     <w:lsdException w:uiPriority="99" w:name="Table Theme"/>
     <w:lsdException w:unhideWhenUsed="0" w:uiPriority="60" w:semiHidden="0" w:name="Light Shading"/>
     <w:lsdException w:unhideWhenUsed="0" w:uiPriority="61" w:semiHidden="0" w:name="Light List"/>
@@ -1221,6 +1274,7 @@
   <w:style w:type="table" w:styleId="7">
     <w:name w:val="Table Grid"/>
     <w:basedOn w:val="3"/>
+    <w:qFormat/>
     <w:uiPriority w:val="39"/>
     <w:pPr>
       <w:widowControl w:val="0"/>

</xml_diff>